<commit_message>
Add KCM design format and apply it across tool and documents
Derive the brand palette by pixel-sampling the KCM company brochure
(blue #045292, lime #B6D55E, marker #E3EA61, plus sub colors), and
codify it as a design-format deck and markdown spec: heading style
with English label and marker highlight, lime diagonal footer stripe,
Q-badge chips, rounded cards. Retheme the explanation deck, both
manual editions, and the tool UI accent colors to match, with a
placeholder logo noted for replacement from the official AI data.

Co-Authored-By: Claude Fable 5 <noreply@anthropic.com>
Claude-Session: https://claude.ai/code/session_01YP9GdZdJDnpqd6g2eHojHD
</commit_message>
<xml_diff>
--- a/sekisan/docs/KCM積算ツール_操作マニュアル.docx
+++ b/sekisan/docs/KCM積算ツール_操作マニュアル.docx
@@ -16,7 +16,7 @@
           <w:rFonts w:ascii="Meiryo UI" w:cs="Meiryo UI" w:eastAsia="Meiryo UI" w:hAnsi="Meiryo UI"/>
           <w:b/>
           <w:bCs/>
-          <w:color w:val="1E2761"/>
+          <w:color w:val="045292"/>
           <w:sz w:val="72"/>
           <w:szCs w:val="72"/>
         </w:rPr>
@@ -33,7 +33,7 @@
           <w:rFonts w:ascii="Meiryo UI" w:cs="Meiryo UI" w:eastAsia="Meiryo UI" w:hAnsi="Meiryo UI"/>
           <w:b/>
           <w:bCs/>
-          <w:color w:val="0F6AB4"/>
+          <w:color w:val="045292"/>
           <w:sz w:val="44"/>
           <w:szCs w:val="44"/>
         </w:rPr>
@@ -99,7 +99,7 @@
           <w:rFonts w:ascii="Meiryo UI" w:cs="Meiryo UI" w:eastAsia="Meiryo UI" w:hAnsi="Meiryo UI"/>
           <w:b/>
           <w:bCs/>
-          <w:color w:val="1E2761"/>
+          <w:color w:val="045292"/>
           <w:sz w:val="30"/>
           <w:szCs w:val="30"/>
         </w:rPr>
@@ -140,7 +140,7 @@
           <w:rFonts w:ascii="Meiryo UI" w:cs="Meiryo UI" w:eastAsia="Meiryo UI" w:hAnsi="Meiryo UI"/>
           <w:b/>
           <w:bCs/>
-          <w:color w:val="1E2761"/>
+          <w:color w:val="045292"/>
           <w:sz w:val="32"/>
           <w:szCs w:val="32"/>
         </w:rPr>
@@ -170,7 +170,7 @@
           <w:rFonts w:ascii="Meiryo UI" w:cs="Meiryo UI" w:eastAsia="Meiryo UI" w:hAnsi="Meiryo UI"/>
           <w:b/>
           <w:bCs/>
-          <w:color w:val="0F6AB4"/>
+          <w:color w:val="045292"/>
           <w:sz w:val="26"/>
           <w:szCs w:val="26"/>
         </w:rPr>
@@ -241,7 +241,7 @@
           <w:rFonts w:ascii="Meiryo UI" w:cs="Meiryo UI" w:eastAsia="Meiryo UI" w:hAnsi="Meiryo UI"/>
           <w:b/>
           <w:bCs/>
-          <w:color w:val="0F6AB4"/>
+          <w:color w:val="045292"/>
           <w:sz w:val="26"/>
           <w:szCs w:val="26"/>
         </w:rPr>
@@ -271,7 +271,7 @@
           <w:rFonts w:ascii="Meiryo UI" w:cs="Meiryo UI" w:eastAsia="Meiryo UI" w:hAnsi="Meiryo UI"/>
           <w:b/>
           <w:bCs/>
-          <w:color w:val="0F6AB4"/>
+          <w:color w:val="045292"/>
           <w:sz w:val="26"/>
           <w:szCs w:val="26"/>
         </w:rPr>
@@ -299,7 +299,7 @@
         <w:tc>
           <w:tcPr>
             <w:tcW w:type="dxa" w:w="1200"/>
-            <w:shd w:fill="EEF1F5" w:val="clear"/>
+            <w:shd w:fill="D9E9F8" w:val="clear"/>
             <w:tcMar>
               <w:top w:type="dxa" w:w="80"/>
               <w:left w:type="dxa" w:w="120"/>
@@ -323,7 +323,7 @@
         <w:tc>
           <w:tcPr>
             <w:tcW w:type="dxa" w:w="3200"/>
-            <w:shd w:fill="EEF1F5" w:val="clear"/>
+            <w:shd w:fill="D9E9F8" w:val="clear"/>
             <w:tcMar>
               <w:top w:type="dxa" w:w="80"/>
               <w:left w:type="dxa" w:w="120"/>
@@ -347,7 +347,7 @@
         <w:tc>
           <w:tcPr>
             <w:tcW w:type="dxa" w:w="4626"/>
-            <w:shd w:fill="EEF1F5" w:val="clear"/>
+            <w:shd w:fill="D9E9F8" w:val="clear"/>
             <w:tcMar>
               <w:top w:type="dxa" w:w="80"/>
               <w:left w:type="dxa" w:w="120"/>
@@ -593,7 +593,7 @@
           <w:rFonts w:ascii="Meiryo UI" w:cs="Meiryo UI" w:eastAsia="Meiryo UI" w:hAnsi="Meiryo UI"/>
           <w:b/>
           <w:bCs/>
-          <w:color w:val="1E2761"/>
+          <w:color w:val="045292"/>
           <w:sz w:val="32"/>
           <w:szCs w:val="32"/>
         </w:rPr>
@@ -669,7 +669,7 @@
           <w:rFonts w:ascii="Meiryo UI" w:cs="Meiryo UI" w:eastAsia="Meiryo UI" w:hAnsi="Meiryo UI"/>
           <w:b/>
           <w:bCs/>
-          <w:color w:val="0F6AB4"/>
+          <w:color w:val="045292"/>
           <w:sz w:val="26"/>
           <w:szCs w:val="26"/>
         </w:rPr>
@@ -685,7 +685,7 @@
           <w:rFonts w:ascii="Meiryo UI" w:cs="Meiryo UI" w:eastAsia="Meiryo UI" w:hAnsi="Meiryo UI"/>
           <w:b/>
           <w:bCs/>
-          <w:color w:val="0F6AB4"/>
+          <w:color w:val="045292"/>
           <w:sz w:val="21"/>
           <w:szCs w:val="21"/>
         </w:rPr>
@@ -709,7 +709,7 @@
           <w:rFonts w:ascii="Meiryo UI" w:cs="Meiryo UI" w:eastAsia="Meiryo UI" w:hAnsi="Meiryo UI"/>
           <w:b/>
           <w:bCs/>
-          <w:color w:val="0F6AB4"/>
+          <w:color w:val="045292"/>
           <w:sz w:val="21"/>
           <w:szCs w:val="21"/>
         </w:rPr>
@@ -733,7 +733,7 @@
           <w:rFonts w:ascii="Meiryo UI" w:cs="Meiryo UI" w:eastAsia="Meiryo UI" w:hAnsi="Meiryo UI"/>
           <w:b/>
           <w:bCs/>
-          <w:color w:val="0F6AB4"/>
+          <w:color w:val="045292"/>
           <w:sz w:val="21"/>
           <w:szCs w:val="21"/>
         </w:rPr>
@@ -751,7 +751,7 @@
     <w:p>
       <w:pPr>
         <w:pBdr>
-          <w:left w:val="single" w:color="0F6AB4" w:sz="18" w:space="8"/>
+          <w:left w:val="single" w:color="045292" w:sz="18" w:space="8"/>
         </w:pBdr>
         <w:spacing w:after="140" w:line="290"/>
         <w:ind w:left="280"/>
@@ -776,7 +776,7 @@
           <w:rFonts w:ascii="Meiryo UI" w:cs="Meiryo UI" w:eastAsia="Meiryo UI" w:hAnsi="Meiryo UI"/>
           <w:b/>
           <w:bCs/>
-          <w:color w:val="0F6AB4"/>
+          <w:color w:val="045292"/>
           <w:sz w:val="26"/>
           <w:szCs w:val="26"/>
         </w:rPr>
@@ -803,7 +803,7 @@
         <w:tc>
           <w:tcPr>
             <w:tcW w:type="dxa" w:w="2800"/>
-            <w:shd w:fill="EEF1F5" w:val="clear"/>
+            <w:shd w:fill="D9E9F8" w:val="clear"/>
             <w:tcMar>
               <w:top w:type="dxa" w:w="80"/>
               <w:left w:type="dxa" w:w="120"/>
@@ -827,7 +827,7 @@
         <w:tc>
           <w:tcPr>
             <w:tcW w:type="dxa" w:w="6226"/>
-            <w:shd w:fill="EEF1F5" w:val="clear"/>
+            <w:shd w:fill="D9E9F8" w:val="clear"/>
             <w:tcMar>
               <w:top w:type="dxa" w:w="80"/>
               <w:left w:type="dxa" w:w="120"/>
@@ -1004,7 +1004,7 @@
           <w:rFonts w:ascii="Meiryo UI" w:cs="Meiryo UI" w:eastAsia="Meiryo UI" w:hAnsi="Meiryo UI"/>
           <w:b/>
           <w:bCs/>
-          <w:color w:val="1E2761"/>
+          <w:color w:val="045292"/>
           <w:sz w:val="32"/>
           <w:szCs w:val="32"/>
         </w:rPr>
@@ -1073,7 +1073,7 @@
     <w:p>
       <w:pPr>
         <w:pBdr>
-          <w:left w:val="single" w:color="0F6AB4" w:sz="18" w:space="8"/>
+          <w:left w:val="single" w:color="045292" w:sz="18" w:space="8"/>
         </w:pBdr>
         <w:spacing w:after="140" w:line="290"/>
         <w:ind w:left="280"/>
@@ -1103,7 +1103,7 @@
           <w:rFonts w:ascii="Meiryo UI" w:cs="Meiryo UI" w:eastAsia="Meiryo UI" w:hAnsi="Meiryo UI"/>
           <w:b/>
           <w:bCs/>
-          <w:color w:val="1E2761"/>
+          <w:color w:val="045292"/>
           <w:sz w:val="32"/>
           <w:szCs w:val="32"/>
         </w:rPr>
@@ -1179,7 +1179,7 @@
           <w:rFonts w:ascii="Meiryo UI" w:cs="Meiryo UI" w:eastAsia="Meiryo UI" w:hAnsi="Meiryo UI"/>
           <w:b/>
           <w:bCs/>
-          <w:color w:val="0F6AB4"/>
+          <w:color w:val="045292"/>
           <w:sz w:val="26"/>
           <w:szCs w:val="26"/>
         </w:rPr>
@@ -1209,7 +1209,7 @@
           <w:rFonts w:ascii="Meiryo UI" w:cs="Meiryo UI" w:eastAsia="Meiryo UI" w:hAnsi="Meiryo UI"/>
           <w:b/>
           <w:bCs/>
-          <w:color w:val="0F6AB4"/>
+          <w:color w:val="045292"/>
           <w:sz w:val="26"/>
           <w:szCs w:val="26"/>
         </w:rPr>
@@ -1237,7 +1237,7 @@
         <w:tc>
           <w:tcPr>
             <w:tcW w:type="dxa" w:w="2200"/>
-            <w:shd w:fill="EEF1F5" w:val="clear"/>
+            <w:shd w:fill="D9E9F8" w:val="clear"/>
             <w:tcMar>
               <w:top w:type="dxa" w:w="80"/>
               <w:left w:type="dxa" w:w="120"/>
@@ -1261,7 +1261,7 @@
         <w:tc>
           <w:tcPr>
             <w:tcW w:type="dxa" w:w="3300"/>
-            <w:shd w:fill="EEF1F5" w:val="clear"/>
+            <w:shd w:fill="D9E9F8" w:val="clear"/>
             <w:tcMar>
               <w:top w:type="dxa" w:w="80"/>
               <w:left w:type="dxa" w:w="120"/>
@@ -1285,7 +1285,7 @@
         <w:tc>
           <w:tcPr>
             <w:tcW w:type="dxa" w:w="3526"/>
-            <w:shd w:fill="EEF1F5" w:val="clear"/>
+            <w:shd w:fill="D9E9F8" w:val="clear"/>
             <w:tcMar>
               <w:top w:type="dxa" w:w="80"/>
               <w:left w:type="dxa" w:w="120"/>
@@ -1619,7 +1619,7 @@
           <w:rFonts w:ascii="Meiryo UI" w:cs="Meiryo UI" w:eastAsia="Meiryo UI" w:hAnsi="Meiryo UI"/>
           <w:b/>
           <w:bCs/>
-          <w:color w:val="0F6AB4"/>
+          <w:color w:val="045292"/>
           <w:sz w:val="26"/>
           <w:szCs w:val="26"/>
         </w:rPr>
@@ -1729,7 +1729,7 @@
     <w:p>
       <w:pPr>
         <w:pBdr>
-          <w:left w:val="single" w:color="0F6AB4" w:sz="18" w:space="8"/>
+          <w:left w:val="single" w:color="045292" w:sz="18" w:space="8"/>
         </w:pBdr>
         <w:spacing w:after="140" w:line="290"/>
         <w:ind w:left="280"/>
@@ -1754,7 +1754,7 @@
           <w:rFonts w:ascii="Meiryo UI" w:cs="Meiryo UI" w:eastAsia="Meiryo UI" w:hAnsi="Meiryo UI"/>
           <w:b/>
           <w:bCs/>
-          <w:color w:val="1E2761"/>
+          <w:color w:val="045292"/>
           <w:sz w:val="32"/>
           <w:szCs w:val="32"/>
         </w:rPr>
@@ -1771,7 +1771,7 @@
           <w:rFonts w:ascii="Meiryo UI" w:cs="Meiryo UI" w:eastAsia="Meiryo UI" w:hAnsi="Meiryo UI"/>
           <w:b/>
           <w:bCs/>
-          <w:color w:val="0F6AB4"/>
+          <w:color w:val="045292"/>
           <w:sz w:val="26"/>
           <w:szCs w:val="26"/>
         </w:rPr>
@@ -1847,7 +1847,7 @@
           <w:rFonts w:ascii="Meiryo UI" w:cs="Meiryo UI" w:eastAsia="Meiryo UI" w:hAnsi="Meiryo UI"/>
           <w:b/>
           <w:bCs/>
-          <w:color w:val="0F6AB4"/>
+          <w:color w:val="045292"/>
           <w:sz w:val="26"/>
           <w:szCs w:val="26"/>
         </w:rPr>
@@ -1863,7 +1863,7 @@
           <w:rFonts w:ascii="Meiryo UI" w:cs="Meiryo UI" w:eastAsia="Meiryo UI" w:hAnsi="Meiryo UI"/>
           <w:b/>
           <w:bCs/>
-          <w:color w:val="0F6AB4"/>
+          <w:color w:val="045292"/>
           <w:sz w:val="21"/>
           <w:szCs w:val="21"/>
         </w:rPr>
@@ -1887,7 +1887,7 @@
           <w:rFonts w:ascii="Meiryo UI" w:cs="Meiryo UI" w:eastAsia="Meiryo UI" w:hAnsi="Meiryo UI"/>
           <w:b/>
           <w:bCs/>
-          <w:color w:val="0F6AB4"/>
+          <w:color w:val="045292"/>
           <w:sz w:val="21"/>
           <w:szCs w:val="21"/>
         </w:rPr>
@@ -1905,7 +1905,7 @@
     <w:p>
       <w:pPr>
         <w:pBdr>
-          <w:left w:val="single" w:color="0F6AB4" w:sz="18" w:space="8"/>
+          <w:left w:val="single" w:color="045292" w:sz="18" w:space="8"/>
         </w:pBdr>
         <w:spacing w:after="140" w:line="290"/>
         <w:ind w:left="280"/>
@@ -1930,7 +1930,7 @@
           <w:rFonts w:ascii="Meiryo UI" w:cs="Meiryo UI" w:eastAsia="Meiryo UI" w:hAnsi="Meiryo UI"/>
           <w:b/>
           <w:bCs/>
-          <w:color w:val="1E2761"/>
+          <w:color w:val="045292"/>
           <w:sz w:val="32"/>
           <w:szCs w:val="32"/>
         </w:rPr>
@@ -2016,7 +2016,7 @@
         <w:tc>
           <w:tcPr>
             <w:tcW w:type="dxa" w:w="3200"/>
-            <w:shd w:fill="EEF1F5" w:val="clear"/>
+            <w:shd w:fill="D9E9F8" w:val="clear"/>
             <w:tcMar>
               <w:top w:type="dxa" w:w="80"/>
               <w:left w:type="dxa" w:w="120"/>
@@ -2040,7 +2040,7 @@
         <w:tc>
           <w:tcPr>
             <w:tcW w:type="dxa" w:w="6826"/>
-            <w:shd w:fill="EEF1F5" w:val="clear"/>
+            <w:shd w:fill="D9E9F8" w:val="clear"/>
             <w:tcMar>
               <w:top w:type="dxa" w:w="80"/>
               <w:left w:type="dxa" w:w="120"/>
@@ -2292,7 +2292,7 @@
           <w:rFonts w:ascii="Meiryo UI" w:cs="Meiryo UI" w:eastAsia="Meiryo UI" w:hAnsi="Meiryo UI"/>
           <w:b/>
           <w:bCs/>
-          <w:color w:val="1E2761"/>
+          <w:color w:val="045292"/>
           <w:sz w:val="32"/>
           <w:szCs w:val="32"/>
         </w:rPr>
@@ -2319,7 +2319,7 @@
         <w:tc>
           <w:tcPr>
             <w:tcW w:type="dxa" w:w="3400"/>
-            <w:shd w:fill="EEF1F5" w:val="clear"/>
+            <w:shd w:fill="D9E9F8" w:val="clear"/>
             <w:tcMar>
               <w:top w:type="dxa" w:w="80"/>
               <w:left w:type="dxa" w:w="120"/>
@@ -2343,7 +2343,7 @@
         <w:tc>
           <w:tcPr>
             <w:tcW w:type="dxa" w:w="6626"/>
-            <w:shd w:fill="EEF1F5" w:val="clear"/>
+            <w:shd w:fill="D9E9F8" w:val="clear"/>
             <w:tcMar>
               <w:top w:type="dxa" w:w="80"/>
               <w:left w:type="dxa" w:w="120"/>

</xml_diff>